<commit_message>
Manual: add dataset section and key code excerpts with explanations
- Section 2: dataset source, citation, columns, cleaning, Excel formulas
- Section 9: tech stack, file structure, REST API, sync design, and
  annotated excerpts of the Excel<->DB sync and the web pages
- Remove outdated empty-state screenshot; template: code 9pt, H1 new page

Co-Authored-By: Claude Opus 5.5 <noreply@anthropic.com>
</commit_message>
<xml_diff>
--- a/docs/reference.docx
+++ b/docs/reference.docx
@@ -667,6 +667,7 @@
     <w:qFormat/>
     <w:rsid w:val="00A10FD9"/>
     <w:pPr>
+      <w:pageBreakBefore/>
       <w:keepNext/>
       <w:keepLines/>
       <w:spacing w:before="360" w:after="80"/>
@@ -1110,7 +1111,8 @@
     <w:basedOn w:val="BodyTextChar"/>
     <w:rPr>
       <w:rFonts w:ascii="Consolas" w:hAnsi="Consolas" w:eastAsia="Tahoma" w:cs="Tahoma"/>
-      <w:sz w:val="22"/>
+      <w:sz w:val="18"/>
+      <w:szCs w:val="18"/>
     </w:rPr>
   </w:style>
   <w:style w:type="character" w:customStyle="1" w:styleId="SectionNumber">
@@ -1147,6 +1149,20 @@
       <w:b w:val="0"/>
       <w:bCs w:val="0"/>
       <w:color w:val="365F91" w:themeColor="accent1" w:themeShade="BF"/>
+    </w:rPr>
+  </w:style>
+  <w:style w:type="paragraph" w:customStyle="1" w:styleId="SourceCode">
+    <w:name w:val="Source Code"/>
+    <w:basedOn w:val="Normal"/>
+    <w:link w:val="VerbatimChar"/>
+    <w:pPr>
+      <w:spacing w:before="0" w:after="0" w:line="240" w:lineRule="auto"/>
+      <w:shd w:val="clear" w:color="auto" w:fill="F6F8FA"/>
+    </w:pPr>
+    <w:rPr>
+      <w:rFonts w:ascii="Consolas" w:hAnsi="Consolas" w:eastAsia="Tahoma" w:cs="Tahoma"/>
+      <w:sz w:val="18"/>
+      <w:szCs w:val="18"/>
     </w:rPr>
   </w:style>
 </w:styles>

</xml_diff>